<commit_message>
Rebuild RK1 for query variant Б and domain 18
Implement musical works and orchestras with 1:N and M:N relations, queries Б1-Б3, six regression tests, new DOCX/PDF reports and actual output. Update verification and variant documentation. Validate 72 Python tests and the coursework checks; visually review all six report pages.
</commit_message>
<xml_diff>
--- a/rk_01/report.docx
+++ b/rk_01/report.docx
@@ -520,7 +520,7 @@
           <w:sz w:val="24"/>
           <w:szCs w:val="24"/>
         </w:rPr>
-        <w:t>«Связи и запросы вариант 21 А»</w:t>
+        <w:t>«Связи и запросы вариант 18 Б»</w:t>
       </w:r>
     </w:p>
     <w:p>
@@ -1135,7 +1135,7 @@
     <w:p>
       <w:pPr>
         <w:keepNext/>
-        <w:spacing w:after="120" w:line="276" w:lineRule="auto"/>
+        <w:spacing w:after="120" w:line="269" w:lineRule="auto"/>
       </w:pPr>
       <w:r>
         <w:rPr>
@@ -1144,12 +1144,12 @@
           <w:color w:val="000000"/>
           <w:sz w:val="28"/>
         </w:rPr>
-        <w:t>Цель и задание</w:t>
-      </w:r>
-    </w:p>
-    <w:p>
-      <w:pPr>
-        <w:spacing w:after="120" w:line="276" w:lineRule="auto"/>
+        <w:t>Задание и модель данных</w:t>
+      </w:r>
+    </w:p>
+    <w:p>
+      <w:pPr>
+        <w:spacing w:after="120" w:line="269" w:lineRule="auto"/>
       </w:pPr>
       <w:r>
         <w:rPr>
@@ -1158,13 +1158,27 @@
           <w:color w:val="000000"/>
           <w:sz w:val="24"/>
         </w:rPr>
-        <w:t>Реализовать обработку связанных коллекций на Python. Вариант предметной области 21: Оператор и Язык программирования. Используется набор запросов А. Программа выполняет соединения один ко многим и многие ко многим, сортировку и агрегирование.</w:t>
+        <w:t>Рубежный контроль №1 по дисциплине «Парадигмы и конструкции языков программирования». Вариант запросов Б, предметная область 18: «Музыкальное произведение — Оркестр». Выполнил Подругин Григорий Романович, группа ИУ5-32Б, зачётная книжка 25У1243.</w:t>
+      </w:r>
+    </w:p>
+    <w:p>
+      <w:pPr>
+        <w:spacing w:after="120" w:line="269" w:lineRule="auto"/>
+      </w:pPr>
+      <w:r>
+        <w:rPr>
+          <w:rFonts w:ascii="Times New Roman" w:hAnsi="Times New Roman"/>
+          <w:b w:val="0"/>
+          <w:color w:val="000000"/>
+          <w:sz w:val="24"/>
+        </w:rPr>
+        <w:t>Цель работы — реализовать обработку связанных коллекций на Python: соединение по идентификаторам, сортировку, подсчёт и отбор данных. В программе представлены отношения один ко многим и многие ко многим.</w:t>
       </w:r>
     </w:p>
     <w:p>
       <w:pPr>
         <w:keepNext/>
-        <w:spacing w:after="120" w:line="276" w:lineRule="auto"/>
+        <w:spacing w:after="120" w:line="269" w:lineRule="auto"/>
       </w:pPr>
       <w:r>
         <w:rPr>
@@ -1173,12 +1187,12 @@
           <w:color w:val="000000"/>
           <w:sz w:val="28"/>
         </w:rPr>
-        <w:t>Модель данных</w:t>
-      </w:r>
-    </w:p>
-    <w:p>
-      <w:pPr>
-        <w:spacing w:after="120" w:line="276" w:lineRule="auto"/>
+        <w:t>Запросы варианта Б</w:t>
+      </w:r>
+    </w:p>
+    <w:p>
+      <w:pPr>
+        <w:spacing w:after="120" w:line="269" w:lineRule="auto"/>
       </w:pPr>
       <w:r>
         <w:rPr>
@@ -1187,12 +1201,12 @@
           <w:color w:val="000000"/>
           <w:sz w:val="24"/>
         </w:rPr>
-        <w:t>Operator хранит id, name, arity и language_id. Арность arity означает число операндов и используется как количественный признак. Language хранит id и name. OperatorLanguage содержит operator_id и language_id и реализует отдельную связь M:N. Основной язык в Operator задаёт учебное распределение для 1:N и не обозначает происхождение оператора.</w:t>
-      </w:r>
-    </w:p>
-    <w:p>
-      <w:pPr>
-        <w:spacing w:after="120" w:line="276" w:lineRule="auto"/>
+        <w:t>Б1. Вывести все связанные музыкальные произведения и их основные оркестры по отношению 1:N. Упорядочить результат по названию произведения по возрастанию.</w:t>
+      </w:r>
+    </w:p>
+    <w:p>
+      <w:pPr>
+        <w:spacing w:after="120" w:line="269" w:lineRule="auto"/>
       </w:pPr>
       <w:r>
         <w:rPr>
@@ -1201,13 +1215,41 @@
           <w:color w:val="000000"/>
           <w:sz w:val="24"/>
         </w:rPr>
-        <w:t>Созданы 4 оператора (+, *, not, -), 3 языка (Python, Rust, Ada) и 5 записей связи. Оператор + связан и с Python, и с Rust; его основной язык в 1:N — Python. Все внешние ключи соответствуют существующим записям.</w:t>
+        <w:t>Б2. Вывести каждый оркестр и количество закреплённых за ним произведений по отношению 1:N. Упорядочить по количеству по возрастанию; при равенстве — по названию оркестра. Пустой оркестр получает количество 0.</w:t>
+      </w:r>
+    </w:p>
+    <w:p>
+      <w:pPr>
+        <w:spacing w:after="120" w:line="269" w:lineRule="auto"/>
+      </w:pPr>
+      <w:r>
+        <w:rPr>
+          <w:rFonts w:ascii="Times New Roman" w:hAnsi="Times New Roman"/>
+          <w:b w:val="0"/>
+          <w:color w:val="000000"/>
+          <w:sz w:val="24"/>
+        </w:rPr>
+        <w:t>Б3. Вывести произведения, названия которых заканчиваются на «ов», и списки исполняющих их оркестров по отношению M:N. Например, условию соответствуют «Вальс цветов» и «Танец эльфов».</w:t>
+      </w:r>
+    </w:p>
+    <w:p>
+      <w:pPr>
+        <w:spacing w:after="120" w:line="269" w:lineRule="auto"/>
+      </w:pPr>
+      <w:r>
+        <w:rPr>
+          <w:rFonts w:ascii="Times New Roman" w:hAnsi="Times New Roman"/>
+          <w:b w:val="0"/>
+          <w:color w:val="000000"/>
+          <w:sz w:val="24"/>
+        </w:rPr>
+        <w:t>При переносе условий примера «сотрудник» заменён музыкальным произведением, «отдел» — оркестром, «фамилия» — названием произведения. Окончание «ов» сохранено. Для сравнения строк без учёта регистра применяется casefold().</w:t>
       </w:r>
     </w:p>
     <w:p>
       <w:pPr>
         <w:keepNext/>
-        <w:spacing w:after="120" w:line="276" w:lineRule="auto"/>
+        <w:spacing w:after="120" w:line="269" w:lineRule="auto"/>
       </w:pPr>
       <w:r>
         <w:rPr>
@@ -1216,12 +1258,12 @@
           <w:color w:val="000000"/>
           <w:sz w:val="28"/>
         </w:rPr>
-        <w:t>Перенос запросов на предметную область</w:t>
-      </w:r>
-    </w:p>
-    <w:p>
-      <w:pPr>
-        <w:spacing w:after="120" w:line="276" w:lineRule="auto"/>
+        <w:t>Классы и отношения</w:t>
+      </w:r>
+    </w:p>
+    <w:p>
+      <w:pPr>
+        <w:spacing w:after="120" w:line="269" w:lineRule="auto"/>
       </w:pPr>
       <w:r>
         <w:rPr>
@@ -1230,12 +1272,12 @@
           <w:color w:val="000000"/>
           <w:sz w:val="24"/>
         </w:rPr>
-        <w:t>А1 выводит пары операторов и основных языков с сортировкой по названию языка. При совпадении языка используется название оператора. А2 суммирует арности по основному языку и сортирует суммы по убыванию; при равенстве используется название языка. Пустые группы исключены, как в примере преподавателя.</w:t>
-      </w:r>
-    </w:p>
-    <w:p>
-      <w:pPr>
-        <w:spacing w:after="120" w:line="276" w:lineRule="auto"/>
+        <w:t>MusicalWork: id, title, duration_minutes, orchestra_id. Длительность в минутах — условный количественный признак. В Б2 требуется число записей, поэтому длительности не суммируются. Orchestra: id и name. WorkOrchestra: work_id и orchestra_id.</w:t>
+      </w:r>
+    </w:p>
+    <w:p>
+      <w:pPr>
+        <w:spacing w:after="120" w:line="269" w:lineRule="auto"/>
       </w:pPr>
       <w:r>
         <w:rPr>
@@ -1244,13 +1286,18 @@
           <w:color w:val="000000"/>
           <w:sz w:val="24"/>
         </w:rPr>
-        <w:t>А3 выбирает языки, содержащие отдельное слово «язык», и выводит списки связанных операторов через таблицу M:N. В шаблоне условия «сотрудник», «отдел», «зарплата» и слово «отдел» заменены соответственно оператором, языком, арностью и словом «язык».</w:t>
+        <w:t>В отношении 1:N поле orchestra_id задаёт один основной оркестр произведения. В отношении M:N отдельный список links допускает исполнение одного произведения несколькими оркестрами и нескольких произведений одним оркестром. Все соединения и подсчёты используют ID.</w:t>
+      </w:r>
+    </w:p>
+    <w:p>
+      <w:r>
+        <w:br w:type="page"/>
       </w:r>
     </w:p>
     <w:p>
       <w:pPr>
         <w:keepNext/>
-        <w:spacing w:after="120" w:line="276" w:lineRule="auto"/>
+        <w:spacing w:after="120" w:line="269" w:lineRule="auto"/>
       </w:pPr>
       <w:r>
         <w:rPr>
@@ -1259,12 +1306,12 @@
           <w:color w:val="000000"/>
           <w:sz w:val="28"/>
         </w:rPr>
-        <w:t>Реализация и запуск</w:t>
-      </w:r>
-    </w:p>
-    <w:p>
-      <w:pPr>
-        <w:spacing w:after="120" w:line="276" w:lineRule="auto"/>
+        <w:t>Тестовые данные</w:t>
+      </w:r>
+    </w:p>
+    <w:p>
+      <w:pPr>
+        <w:spacing w:after="120" w:line="269" w:lineRule="auto"/>
       </w:pPr>
       <w:r>
         <w:rPr>
@@ -1273,12 +1320,977 @@
           <w:color w:val="000000"/>
           <w:sz w:val="24"/>
         </w:rPr>
-        <w:t>Для соединений применены list comprehensions, для А3 — dict comprehension. Используются sorted, sum, any и itemgetter. Данные заданы в памяти, внешние библиотеки и подключение к сети не требуются. Python 3.10 или новее.</w:t>
-      </w:r>
-    </w:p>
-    <w:p>
-      <w:pPr>
-        <w:spacing w:after="0" w:line="224" w:lineRule="exact"/>
+        <w:t>В памяти создаются 4 произведения, 3 оркестра и 5 записей связи. Каждая коллекция содержит от 3 до 5 объектов. Репертуар и длительности заданы как учебные данные.</w:t>
+      </w:r>
+    </w:p>
+    <w:p>
+      <w:pPr>
+        <w:keepNext/>
+        <w:spacing w:after="120" w:line="269" w:lineRule="auto"/>
+      </w:pPr>
+      <w:r>
+        <w:rPr>
+          <w:rFonts w:ascii="Times New Roman" w:hAnsi="Times New Roman"/>
+          <w:b/>
+          <w:color w:val="000000"/>
+          <w:sz w:val="28"/>
+        </w:rPr>
+        <w:t>Оркестры</w:t>
+      </w:r>
+    </w:p>
+    <w:tbl>
+      <w:tblPr>
+        <w:tblW w:type="auto" w:w="0"/>
+        <w:tblLayout w:type="fixed"/>
+        <w:tblLook w:firstColumn="1" w:firstRow="1" w:lastColumn="0" w:lastRow="0" w:noHBand="0" w:noVBand="1" w:val="04A0"/>
+      </w:tblPr>
+      <w:tblGrid>
+        <w:gridCol w:w="720"/>
+        <w:gridCol w:w="8496"/>
+      </w:tblGrid>
+      <w:tr>
+        <w:trPr>
+          <w:cantSplit/>
+          <w:tblHeader/>
+        </w:trPr>
+        <w:tc>
+          <w:tcPr>
+            <w:tcW w:type="dxa" w:w="4674"/>
+          </w:tcPr>
+          <w:p>
+            <w:pPr>
+              <w:spacing w:after="80" w:before="80"/>
+            </w:pPr>
+            <w:r>
+              <w:rPr>
+                <w:rFonts w:ascii="Times New Roman" w:hAnsi="Times New Roman"/>
+                <w:b/>
+                <w:sz w:val="22"/>
+              </w:rPr>
+              <w:t>ID</w:t>
+            </w:r>
+          </w:p>
+        </w:tc>
+        <w:tc>
+          <w:tcPr>
+            <w:tcW w:type="dxa" w:w="4674"/>
+          </w:tcPr>
+          <w:p>
+            <w:pPr>
+              <w:spacing w:after="80" w:before="80"/>
+            </w:pPr>
+            <w:r>
+              <w:rPr>
+                <w:rFonts w:ascii="Times New Roman" w:hAnsi="Times New Roman"/>
+                <w:b/>
+                <w:sz w:val="22"/>
+              </w:rPr>
+              <w:t>Название</w:t>
+            </w:r>
+          </w:p>
+        </w:tc>
+      </w:tr>
+      <w:tr>
+        <w:trPr>
+          <w:cantSplit/>
+        </w:trPr>
+        <w:tc>
+          <w:tcPr>
+            <w:tcW w:type="dxa" w:w="720"/>
+          </w:tcPr>
+          <w:p>
+            <w:pPr>
+              <w:spacing w:after="80" w:before="80"/>
+            </w:pPr>
+            <w:r>
+              <w:rPr>
+                <w:rFonts w:ascii="Times New Roman" w:hAnsi="Times New Roman"/>
+                <w:b w:val="0"/>
+                <w:sz w:val="22"/>
+              </w:rPr>
+              <w:t>1</w:t>
+            </w:r>
+          </w:p>
+        </w:tc>
+        <w:tc>
+          <w:tcPr>
+            <w:tcW w:type="dxa" w:w="8496"/>
+          </w:tcPr>
+          <w:p>
+            <w:pPr>
+              <w:spacing w:after="80" w:before="80"/>
+            </w:pPr>
+            <w:r>
+              <w:rPr>
+                <w:rFonts w:ascii="Times New Roman" w:hAnsi="Times New Roman"/>
+                <w:b w:val="0"/>
+                <w:sz w:val="22"/>
+              </w:rPr>
+              <w:t>Симфонический оркестр</w:t>
+            </w:r>
+          </w:p>
+        </w:tc>
+      </w:tr>
+      <w:tr>
+        <w:trPr>
+          <w:cantSplit/>
+        </w:trPr>
+        <w:tc>
+          <w:tcPr>
+            <w:tcW w:type="dxa" w:w="720"/>
+          </w:tcPr>
+          <w:p>
+            <w:pPr>
+              <w:spacing w:after="80" w:before="80"/>
+            </w:pPr>
+            <w:r>
+              <w:rPr>
+                <w:rFonts w:ascii="Times New Roman" w:hAnsi="Times New Roman"/>
+                <w:b w:val="0"/>
+                <w:sz w:val="22"/>
+              </w:rPr>
+              <w:t>2</w:t>
+            </w:r>
+          </w:p>
+        </w:tc>
+        <w:tc>
+          <w:tcPr>
+            <w:tcW w:type="dxa" w:w="8496"/>
+          </w:tcPr>
+          <w:p>
+            <w:pPr>
+              <w:spacing w:after="80" w:before="80"/>
+            </w:pPr>
+            <w:r>
+              <w:rPr>
+                <w:rFonts w:ascii="Times New Roman" w:hAnsi="Times New Roman"/>
+                <w:b w:val="0"/>
+                <w:sz w:val="22"/>
+              </w:rPr>
+              <w:t>Камерный оркестр</w:t>
+            </w:r>
+          </w:p>
+        </w:tc>
+      </w:tr>
+      <w:tr>
+        <w:trPr>
+          <w:cantSplit/>
+        </w:trPr>
+        <w:tc>
+          <w:tcPr>
+            <w:tcW w:type="dxa" w:w="720"/>
+          </w:tcPr>
+          <w:p>
+            <w:pPr>
+              <w:spacing w:after="80" w:before="80"/>
+            </w:pPr>
+            <w:r>
+              <w:rPr>
+                <w:rFonts w:ascii="Times New Roman" w:hAnsi="Times New Roman"/>
+                <w:b w:val="0"/>
+                <w:sz w:val="22"/>
+              </w:rPr>
+              <w:t>3</w:t>
+            </w:r>
+          </w:p>
+        </w:tc>
+        <w:tc>
+          <w:tcPr>
+            <w:tcW w:type="dxa" w:w="8496"/>
+          </w:tcPr>
+          <w:p>
+            <w:pPr>
+              <w:spacing w:after="80" w:before="80"/>
+            </w:pPr>
+            <w:r>
+              <w:rPr>
+                <w:rFonts w:ascii="Times New Roman" w:hAnsi="Times New Roman"/>
+                <w:b w:val="0"/>
+                <w:sz w:val="22"/>
+              </w:rPr>
+              <w:t>Филармонический оркестр</w:t>
+            </w:r>
+          </w:p>
+        </w:tc>
+      </w:tr>
+    </w:tbl>
+    <w:p>
+      <w:pPr>
+        <w:spacing w:after="120" w:line="269" w:lineRule="auto"/>
+      </w:pPr>
+      <w:r>
+        <w:rPr>
+          <w:rFonts w:ascii="Times New Roman" w:hAnsi="Times New Roman"/>
+          <w:b w:val="0"/>
+          <w:color w:val="000000"/>
+          <w:sz w:val="8"/>
+        </w:rPr>
+      </w:r>
+    </w:p>
+    <w:p>
+      <w:pPr>
+        <w:keepNext/>
+        <w:spacing w:after="120" w:line="269" w:lineRule="auto"/>
+      </w:pPr>
+      <w:r>
+        <w:rPr>
+          <w:rFonts w:ascii="Times New Roman" w:hAnsi="Times New Roman"/>
+          <w:b/>
+          <w:color w:val="000000"/>
+          <w:sz w:val="28"/>
+        </w:rPr>
+        <w:t>Музыкальные произведения</w:t>
+      </w:r>
+    </w:p>
+    <w:tbl>
+      <w:tblPr>
+        <w:tblW w:type="auto" w:w="0"/>
+        <w:tblLayout w:type="fixed"/>
+        <w:tblLook w:firstColumn="1" w:firstRow="1" w:lastColumn="0" w:lastRow="0" w:noHBand="0" w:noVBand="1" w:val="04A0"/>
+      </w:tblPr>
+      <w:tblGrid>
+        <w:gridCol w:w="576"/>
+        <w:gridCol w:w="5184"/>
+        <w:gridCol w:w="1440"/>
+        <w:gridCol w:w="2016"/>
+      </w:tblGrid>
+      <w:tr>
+        <w:trPr>
+          <w:cantSplit/>
+          <w:tblHeader/>
+        </w:trPr>
+        <w:tc>
+          <w:tcPr>
+            <w:tcW w:type="dxa" w:w="2337"/>
+          </w:tcPr>
+          <w:p>
+            <w:pPr>
+              <w:spacing w:after="80" w:before="80"/>
+            </w:pPr>
+            <w:r>
+              <w:rPr>
+                <w:rFonts w:ascii="Times New Roman" w:hAnsi="Times New Roman"/>
+                <w:b/>
+                <w:sz w:val="22"/>
+              </w:rPr>
+              <w:t>ID</w:t>
+            </w:r>
+          </w:p>
+        </w:tc>
+        <w:tc>
+          <w:tcPr>
+            <w:tcW w:type="dxa" w:w="2337"/>
+          </w:tcPr>
+          <w:p>
+            <w:pPr>
+              <w:spacing w:after="80" w:before="80"/>
+            </w:pPr>
+            <w:r>
+              <w:rPr>
+                <w:rFonts w:ascii="Times New Roman" w:hAnsi="Times New Roman"/>
+                <w:b/>
+                <w:sz w:val="22"/>
+              </w:rPr>
+              <w:t>Название</w:t>
+            </w:r>
+          </w:p>
+        </w:tc>
+        <w:tc>
+          <w:tcPr>
+            <w:tcW w:type="dxa" w:w="2337"/>
+          </w:tcPr>
+          <w:p>
+            <w:pPr>
+              <w:spacing w:after="80" w:before="80"/>
+            </w:pPr>
+            <w:r>
+              <w:rPr>
+                <w:rFonts w:ascii="Times New Roman" w:hAnsi="Times New Roman"/>
+                <w:b/>
+                <w:sz w:val="22"/>
+              </w:rPr>
+              <w:t>Минуты</w:t>
+            </w:r>
+          </w:p>
+        </w:tc>
+        <w:tc>
+          <w:tcPr>
+            <w:tcW w:type="dxa" w:w="2337"/>
+          </w:tcPr>
+          <w:p>
+            <w:pPr>
+              <w:spacing w:after="80" w:before="80"/>
+            </w:pPr>
+            <w:r>
+              <w:rPr>
+                <w:rFonts w:ascii="Times New Roman" w:hAnsi="Times New Roman"/>
+                <w:b/>
+                <w:sz w:val="22"/>
+              </w:rPr>
+              <w:t>ID оркестра</w:t>
+            </w:r>
+          </w:p>
+        </w:tc>
+      </w:tr>
+      <w:tr>
+        <w:trPr>
+          <w:cantSplit/>
+        </w:trPr>
+        <w:tc>
+          <w:tcPr>
+            <w:tcW w:type="dxa" w:w="576"/>
+          </w:tcPr>
+          <w:p>
+            <w:pPr>
+              <w:spacing w:after="80" w:before="80"/>
+            </w:pPr>
+            <w:r>
+              <w:rPr>
+                <w:rFonts w:ascii="Times New Roman" w:hAnsi="Times New Roman"/>
+                <w:b w:val="0"/>
+                <w:sz w:val="22"/>
+              </w:rPr>
+              <w:t>1</w:t>
+            </w:r>
+          </w:p>
+        </w:tc>
+        <w:tc>
+          <w:tcPr>
+            <w:tcW w:type="dxa" w:w="5184"/>
+          </w:tcPr>
+          <w:p>
+            <w:pPr>
+              <w:spacing w:after="80" w:before="80"/>
+            </w:pPr>
+            <w:r>
+              <w:rPr>
+                <w:rFonts w:ascii="Times New Roman" w:hAnsi="Times New Roman"/>
+                <w:b w:val="0"/>
+                <w:sz w:val="22"/>
+              </w:rPr>
+              <w:t>Вальс цветов</w:t>
+            </w:r>
+          </w:p>
+        </w:tc>
+        <w:tc>
+          <w:tcPr>
+            <w:tcW w:type="dxa" w:w="1440"/>
+          </w:tcPr>
+          <w:p>
+            <w:pPr>
+              <w:spacing w:after="80" w:before="80"/>
+            </w:pPr>
+            <w:r>
+              <w:rPr>
+                <w:rFonts w:ascii="Times New Roman" w:hAnsi="Times New Roman"/>
+                <w:b w:val="0"/>
+                <w:sz w:val="22"/>
+              </w:rPr>
+              <w:t>8</w:t>
+            </w:r>
+          </w:p>
+        </w:tc>
+        <w:tc>
+          <w:tcPr>
+            <w:tcW w:type="dxa" w:w="2016"/>
+          </w:tcPr>
+          <w:p>
+            <w:pPr>
+              <w:spacing w:after="80" w:before="80"/>
+            </w:pPr>
+            <w:r>
+              <w:rPr>
+                <w:rFonts w:ascii="Times New Roman" w:hAnsi="Times New Roman"/>
+                <w:b w:val="0"/>
+                <w:sz w:val="22"/>
+              </w:rPr>
+              <w:t>1</w:t>
+            </w:r>
+          </w:p>
+        </w:tc>
+      </w:tr>
+      <w:tr>
+        <w:trPr>
+          <w:cantSplit/>
+        </w:trPr>
+        <w:tc>
+          <w:tcPr>
+            <w:tcW w:type="dxa" w:w="576"/>
+          </w:tcPr>
+          <w:p>
+            <w:pPr>
+              <w:spacing w:after="80" w:before="80"/>
+            </w:pPr>
+            <w:r>
+              <w:rPr>
+                <w:rFonts w:ascii="Times New Roman" w:hAnsi="Times New Roman"/>
+                <w:b w:val="0"/>
+                <w:sz w:val="22"/>
+              </w:rPr>
+              <w:t>2</w:t>
+            </w:r>
+          </w:p>
+        </w:tc>
+        <w:tc>
+          <w:tcPr>
+            <w:tcW w:type="dxa" w:w="5184"/>
+          </w:tcPr>
+          <w:p>
+            <w:pPr>
+              <w:spacing w:after="80" w:before="80"/>
+            </w:pPr>
+            <w:r>
+              <w:rPr>
+                <w:rFonts w:ascii="Times New Roman" w:hAnsi="Times New Roman"/>
+                <w:b w:val="0"/>
+                <w:sz w:val="22"/>
+              </w:rPr>
+              <w:t>Танец эльфов</w:t>
+            </w:r>
+          </w:p>
+        </w:tc>
+        <w:tc>
+          <w:tcPr>
+            <w:tcW w:type="dxa" w:w="1440"/>
+          </w:tcPr>
+          <w:p>
+            <w:pPr>
+              <w:spacing w:after="80" w:before="80"/>
+            </w:pPr>
+            <w:r>
+              <w:rPr>
+                <w:rFonts w:ascii="Times New Roman" w:hAnsi="Times New Roman"/>
+                <w:b w:val="0"/>
+                <w:sz w:val="22"/>
+              </w:rPr>
+              <w:t>3</w:t>
+            </w:r>
+          </w:p>
+        </w:tc>
+        <w:tc>
+          <w:tcPr>
+            <w:tcW w:type="dxa" w:w="2016"/>
+          </w:tcPr>
+          <w:p>
+            <w:pPr>
+              <w:spacing w:after="80" w:before="80"/>
+            </w:pPr>
+            <w:r>
+              <w:rPr>
+                <w:rFonts w:ascii="Times New Roman" w:hAnsi="Times New Roman"/>
+                <w:b w:val="0"/>
+                <w:sz w:val="22"/>
+              </w:rPr>
+              <w:t>2</w:t>
+            </w:r>
+          </w:p>
+        </w:tc>
+      </w:tr>
+      <w:tr>
+        <w:trPr>
+          <w:cantSplit/>
+        </w:trPr>
+        <w:tc>
+          <w:tcPr>
+            <w:tcW w:type="dxa" w:w="576"/>
+          </w:tcPr>
+          <w:p>
+            <w:pPr>
+              <w:spacing w:after="80" w:before="80"/>
+            </w:pPr>
+            <w:r>
+              <w:rPr>
+                <w:rFonts w:ascii="Times New Roman" w:hAnsi="Times New Roman"/>
+                <w:b w:val="0"/>
+                <w:sz w:val="22"/>
+              </w:rPr>
+              <w:t>3</w:t>
+            </w:r>
+          </w:p>
+        </w:tc>
+        <w:tc>
+          <w:tcPr>
+            <w:tcW w:type="dxa" w:w="5184"/>
+          </w:tcPr>
+          <w:p>
+            <w:pPr>
+              <w:spacing w:after="80" w:before="80"/>
+            </w:pPr>
+            <w:r>
+              <w:rPr>
+                <w:rFonts w:ascii="Times New Roman" w:hAnsi="Times New Roman"/>
+                <w:b w:val="0"/>
+                <w:sz w:val="22"/>
+              </w:rPr>
+              <w:t>Танец рыцарей</w:t>
+            </w:r>
+          </w:p>
+        </w:tc>
+        <w:tc>
+          <w:tcPr>
+            <w:tcW w:type="dxa" w:w="1440"/>
+          </w:tcPr>
+          <w:p>
+            <w:pPr>
+              <w:spacing w:after="80" w:before="80"/>
+            </w:pPr>
+            <w:r>
+              <w:rPr>
+                <w:rFonts w:ascii="Times New Roman" w:hAnsi="Times New Roman"/>
+                <w:b w:val="0"/>
+                <w:sz w:val="22"/>
+              </w:rPr>
+              <w:t>5</w:t>
+            </w:r>
+          </w:p>
+        </w:tc>
+        <w:tc>
+          <w:tcPr>
+            <w:tcW w:type="dxa" w:w="2016"/>
+          </w:tcPr>
+          <w:p>
+            <w:pPr>
+              <w:spacing w:after="80" w:before="80"/>
+            </w:pPr>
+            <w:r>
+              <w:rPr>
+                <w:rFonts w:ascii="Times New Roman" w:hAnsi="Times New Roman"/>
+                <w:b w:val="0"/>
+                <w:sz w:val="22"/>
+              </w:rPr>
+              <w:t>1</w:t>
+            </w:r>
+          </w:p>
+        </w:tc>
+      </w:tr>
+      <w:tr>
+        <w:trPr>
+          <w:cantSplit/>
+        </w:trPr>
+        <w:tc>
+          <w:tcPr>
+            <w:tcW w:type="dxa" w:w="576"/>
+          </w:tcPr>
+          <w:p>
+            <w:pPr>
+              <w:spacing w:after="80" w:before="80"/>
+            </w:pPr>
+            <w:r>
+              <w:rPr>
+                <w:rFonts w:ascii="Times New Roman" w:hAnsi="Times New Roman"/>
+                <w:b w:val="0"/>
+                <w:sz w:val="22"/>
+              </w:rPr>
+              <w:t>4</w:t>
+            </w:r>
+          </w:p>
+        </w:tc>
+        <w:tc>
+          <w:tcPr>
+            <w:tcW w:type="dxa" w:w="5184"/>
+          </w:tcPr>
+          <w:p>
+            <w:pPr>
+              <w:spacing w:after="80" w:before="80"/>
+            </w:pPr>
+            <w:r>
+              <w:rPr>
+                <w:rFonts w:ascii="Times New Roman" w:hAnsi="Times New Roman"/>
+                <w:b w:val="0"/>
+                <w:sz w:val="22"/>
+              </w:rPr>
+              <w:t>Полет шмеля</w:t>
+            </w:r>
+          </w:p>
+        </w:tc>
+        <w:tc>
+          <w:tcPr>
+            <w:tcW w:type="dxa" w:w="1440"/>
+          </w:tcPr>
+          <w:p>
+            <w:pPr>
+              <w:spacing w:after="80" w:before="80"/>
+            </w:pPr>
+            <w:r>
+              <w:rPr>
+                <w:rFonts w:ascii="Times New Roman" w:hAnsi="Times New Roman"/>
+                <w:b w:val="0"/>
+                <w:sz w:val="22"/>
+              </w:rPr>
+              <w:t>2</w:t>
+            </w:r>
+          </w:p>
+        </w:tc>
+        <w:tc>
+          <w:tcPr>
+            <w:tcW w:type="dxa" w:w="2016"/>
+          </w:tcPr>
+          <w:p>
+            <w:pPr>
+              <w:spacing w:after="80" w:before="80"/>
+            </w:pPr>
+            <w:r>
+              <w:rPr>
+                <w:rFonts w:ascii="Times New Roman" w:hAnsi="Times New Roman"/>
+                <w:b w:val="0"/>
+                <w:sz w:val="22"/>
+              </w:rPr>
+              <w:t>3</w:t>
+            </w:r>
+          </w:p>
+        </w:tc>
+      </w:tr>
+    </w:tbl>
+    <w:p>
+      <w:pPr>
+        <w:spacing w:after="120" w:line="269" w:lineRule="auto"/>
+      </w:pPr>
+      <w:r>
+        <w:rPr>
+          <w:rFonts w:ascii="Times New Roman" w:hAnsi="Times New Roman"/>
+          <w:b w:val="0"/>
+          <w:color w:val="000000"/>
+          <w:sz w:val="8"/>
+        </w:rPr>
+      </w:r>
+    </w:p>
+    <w:p>
+      <w:pPr>
+        <w:keepNext/>
+        <w:spacing w:after="120" w:line="269" w:lineRule="auto"/>
+      </w:pPr>
+      <w:r>
+        <w:rPr>
+          <w:rFonts w:ascii="Times New Roman" w:hAnsi="Times New Roman"/>
+          <w:b/>
+          <w:color w:val="000000"/>
+          <w:sz w:val="28"/>
+        </w:rPr>
+        <w:t>Связи многие ко многим</w:t>
+      </w:r>
+    </w:p>
+    <w:tbl>
+      <w:tblPr>
+        <w:tblW w:type="auto" w:w="0"/>
+        <w:tblLayout w:type="fixed"/>
+        <w:tblLook w:firstColumn="1" w:firstRow="1" w:lastColumn="0" w:lastRow="0" w:noHBand="0" w:noVBand="1" w:val="04A0"/>
+      </w:tblPr>
+      <w:tblGrid>
+        <w:gridCol w:w="4608"/>
+        <w:gridCol w:w="4608"/>
+      </w:tblGrid>
+      <w:tr>
+        <w:trPr>
+          <w:cantSplit/>
+          <w:tblHeader/>
+        </w:trPr>
+        <w:tc>
+          <w:tcPr>
+            <w:tcW w:type="dxa" w:w="4674"/>
+          </w:tcPr>
+          <w:p>
+            <w:pPr>
+              <w:spacing w:after="80" w:before="80"/>
+            </w:pPr>
+            <w:r>
+              <w:rPr>
+                <w:rFonts w:ascii="Times New Roman" w:hAnsi="Times New Roman"/>
+                <w:b/>
+                <w:sz w:val="22"/>
+              </w:rPr>
+              <w:t>ID произведения</w:t>
+            </w:r>
+          </w:p>
+        </w:tc>
+        <w:tc>
+          <w:tcPr>
+            <w:tcW w:type="dxa" w:w="4674"/>
+          </w:tcPr>
+          <w:p>
+            <w:pPr>
+              <w:spacing w:after="80" w:before="80"/>
+            </w:pPr>
+            <w:r>
+              <w:rPr>
+                <w:rFonts w:ascii="Times New Roman" w:hAnsi="Times New Roman"/>
+                <w:b/>
+                <w:sz w:val="22"/>
+              </w:rPr>
+              <w:t>ID оркестра</w:t>
+            </w:r>
+          </w:p>
+        </w:tc>
+      </w:tr>
+      <w:tr>
+        <w:trPr>
+          <w:cantSplit/>
+        </w:trPr>
+        <w:tc>
+          <w:tcPr>
+            <w:tcW w:type="dxa" w:w="4608"/>
+          </w:tcPr>
+          <w:p>
+            <w:pPr>
+              <w:spacing w:after="80" w:before="80"/>
+            </w:pPr>
+            <w:r>
+              <w:rPr>
+                <w:rFonts w:ascii="Times New Roman" w:hAnsi="Times New Roman"/>
+                <w:b w:val="0"/>
+                <w:sz w:val="22"/>
+              </w:rPr>
+              <w:t>1</w:t>
+            </w:r>
+          </w:p>
+        </w:tc>
+        <w:tc>
+          <w:tcPr>
+            <w:tcW w:type="dxa" w:w="4608"/>
+          </w:tcPr>
+          <w:p>
+            <w:pPr>
+              <w:spacing w:after="80" w:before="80"/>
+            </w:pPr>
+            <w:r>
+              <w:rPr>
+                <w:rFonts w:ascii="Times New Roman" w:hAnsi="Times New Roman"/>
+                <w:b w:val="0"/>
+                <w:sz w:val="22"/>
+              </w:rPr>
+              <w:t>1</w:t>
+            </w:r>
+          </w:p>
+        </w:tc>
+      </w:tr>
+      <w:tr>
+        <w:trPr>
+          <w:cantSplit/>
+        </w:trPr>
+        <w:tc>
+          <w:tcPr>
+            <w:tcW w:type="dxa" w:w="4608"/>
+          </w:tcPr>
+          <w:p>
+            <w:pPr>
+              <w:spacing w:after="80" w:before="80"/>
+            </w:pPr>
+            <w:r>
+              <w:rPr>
+                <w:rFonts w:ascii="Times New Roman" w:hAnsi="Times New Roman"/>
+                <w:b w:val="0"/>
+                <w:sz w:val="22"/>
+              </w:rPr>
+              <w:t>1</w:t>
+            </w:r>
+          </w:p>
+        </w:tc>
+        <w:tc>
+          <w:tcPr>
+            <w:tcW w:type="dxa" w:w="4608"/>
+          </w:tcPr>
+          <w:p>
+            <w:pPr>
+              <w:spacing w:after="80" w:before="80"/>
+            </w:pPr>
+            <w:r>
+              <w:rPr>
+                <w:rFonts w:ascii="Times New Roman" w:hAnsi="Times New Roman"/>
+                <w:b w:val="0"/>
+                <w:sz w:val="22"/>
+              </w:rPr>
+              <w:t>2</w:t>
+            </w:r>
+          </w:p>
+        </w:tc>
+      </w:tr>
+      <w:tr>
+        <w:trPr>
+          <w:cantSplit/>
+        </w:trPr>
+        <w:tc>
+          <w:tcPr>
+            <w:tcW w:type="dxa" w:w="4608"/>
+          </w:tcPr>
+          <w:p>
+            <w:pPr>
+              <w:spacing w:after="80" w:before="80"/>
+            </w:pPr>
+            <w:r>
+              <w:rPr>
+                <w:rFonts w:ascii="Times New Roman" w:hAnsi="Times New Roman"/>
+                <w:b w:val="0"/>
+                <w:sz w:val="22"/>
+              </w:rPr>
+              <w:t>2</w:t>
+            </w:r>
+          </w:p>
+        </w:tc>
+        <w:tc>
+          <w:tcPr>
+            <w:tcW w:type="dxa" w:w="4608"/>
+          </w:tcPr>
+          <w:p>
+            <w:pPr>
+              <w:spacing w:after="80" w:before="80"/>
+            </w:pPr>
+            <w:r>
+              <w:rPr>
+                <w:rFonts w:ascii="Times New Roman" w:hAnsi="Times New Roman"/>
+                <w:b w:val="0"/>
+                <w:sz w:val="22"/>
+              </w:rPr>
+              <w:t>2</w:t>
+            </w:r>
+          </w:p>
+        </w:tc>
+      </w:tr>
+      <w:tr>
+        <w:trPr>
+          <w:cantSplit/>
+        </w:trPr>
+        <w:tc>
+          <w:tcPr>
+            <w:tcW w:type="dxa" w:w="4608"/>
+          </w:tcPr>
+          <w:p>
+            <w:pPr>
+              <w:spacing w:after="80" w:before="80"/>
+            </w:pPr>
+            <w:r>
+              <w:rPr>
+                <w:rFonts w:ascii="Times New Roman" w:hAnsi="Times New Roman"/>
+                <w:b w:val="0"/>
+                <w:sz w:val="22"/>
+              </w:rPr>
+              <w:t>3</w:t>
+            </w:r>
+          </w:p>
+        </w:tc>
+        <w:tc>
+          <w:tcPr>
+            <w:tcW w:type="dxa" w:w="4608"/>
+          </w:tcPr>
+          <w:p>
+            <w:pPr>
+              <w:spacing w:after="80" w:before="80"/>
+            </w:pPr>
+            <w:r>
+              <w:rPr>
+                <w:rFonts w:ascii="Times New Roman" w:hAnsi="Times New Roman"/>
+                <w:b w:val="0"/>
+                <w:sz w:val="22"/>
+              </w:rPr>
+              <w:t>1</w:t>
+            </w:r>
+          </w:p>
+        </w:tc>
+      </w:tr>
+      <w:tr>
+        <w:trPr>
+          <w:cantSplit/>
+        </w:trPr>
+        <w:tc>
+          <w:tcPr>
+            <w:tcW w:type="dxa" w:w="4608"/>
+          </w:tcPr>
+          <w:p>
+            <w:pPr>
+              <w:spacing w:after="80" w:before="80"/>
+            </w:pPr>
+            <w:r>
+              <w:rPr>
+                <w:rFonts w:ascii="Times New Roman" w:hAnsi="Times New Roman"/>
+                <w:b w:val="0"/>
+                <w:sz w:val="22"/>
+              </w:rPr>
+              <w:t>4</w:t>
+            </w:r>
+          </w:p>
+        </w:tc>
+        <w:tc>
+          <w:tcPr>
+            <w:tcW w:type="dxa" w:w="4608"/>
+          </w:tcPr>
+          <w:p>
+            <w:pPr>
+              <w:spacing w:after="80" w:before="80"/>
+            </w:pPr>
+            <w:r>
+              <w:rPr>
+                <w:rFonts w:ascii="Times New Roman" w:hAnsi="Times New Roman"/>
+                <w:b w:val="0"/>
+                <w:sz w:val="22"/>
+              </w:rPr>
+              <w:t>3</w:t>
+            </w:r>
+          </w:p>
+        </w:tc>
+      </w:tr>
+    </w:tbl>
+    <w:p>
+      <w:pPr>
+        <w:spacing w:after="120" w:line="269" w:lineRule="auto"/>
+      </w:pPr>
+      <w:r>
+        <w:rPr>
+          <w:rFonts w:ascii="Times New Roman" w:hAnsi="Times New Roman"/>
+          <w:b w:val="0"/>
+          <w:color w:val="000000"/>
+          <w:sz w:val="8"/>
+        </w:rPr>
+      </w:r>
+    </w:p>
+    <w:p>
+      <w:pPr>
+        <w:spacing w:after="120" w:line="269" w:lineRule="auto"/>
+      </w:pPr>
+      <w:r>
+        <w:rPr>
+          <w:rFonts w:ascii="Times New Roman" w:hAnsi="Times New Roman"/>
+          <w:b w:val="0"/>
+          <w:color w:val="000000"/>
+          <w:sz w:val="24"/>
+        </w:rPr>
+        <w:t>«Вальс цветов» закреплён за Симфоническим оркестром в 1:N, а в M:N связан также с Камерным оркестром. Поэтому Б2 даёт Камерному оркестру 1 произведение, а Б3 включает его в список оркестров «Вальса цветов». Это различие демонстрирует независимость отношений.</w:t>
+      </w:r>
+    </w:p>
+    <w:p>
+      <w:r>
+        <w:br w:type="page"/>
+      </w:r>
+    </w:p>
+    <w:p>
+      <w:pPr>
+        <w:keepNext/>
+        <w:spacing w:after="120" w:line="269" w:lineRule="auto"/>
+      </w:pPr>
+      <w:r>
+        <w:rPr>
+          <w:rFonts w:ascii="Times New Roman" w:hAnsi="Times New Roman"/>
+          <w:b/>
+          <w:color w:val="000000"/>
+          <w:sz w:val="28"/>
+        </w:rPr>
+        <w:t>Результаты выполнения</w:t>
+      </w:r>
+    </w:p>
+    <w:p>
+      <w:pPr>
+        <w:spacing w:after="120" w:line="269" w:lineRule="auto"/>
+      </w:pPr>
+      <w:r>
+        <w:rPr>
+          <w:rFonts w:ascii="Times New Roman" w:hAnsi="Times New Roman"/>
+          <w:b w:val="0"/>
+          <w:color w:val="000000"/>
+          <w:sz w:val="24"/>
+        </w:rPr>
+        <w:t>Запуск из корня репозитория на Python 3.10 или новее. Внешние библиотеки для программы и проверок РК1 не требуются.</w:t>
+      </w:r>
+    </w:p>
+    <w:p>
+      <w:pPr>
+        <w:spacing w:after="0" w:line="210" w:lineRule="exact"/>
       </w:pPr>
       <w:r>
         <w:rPr>
@@ -1291,45 +2303,11 @@
       </w:r>
     </w:p>
     <w:p>
-      <w:pPr>
-        <w:spacing w:after="120" w:line="276" w:lineRule="auto"/>
-      </w:pPr>
-      <w:r>
-        <w:rPr>
-          <w:rFonts w:ascii="Times New Roman" w:hAnsi="Times New Roman"/>
-          <w:b w:val="0"/>
-          <w:color w:val="000000"/>
-          <w:sz w:val="20"/>
-        </w:rPr>
-        <w:t>Команда выполняется из корня pcpl-labs.</w:t>
-      </w:r>
-    </w:p>
-    <w:p>
-      <w:r>
-        <w:br w:type="page"/>
-      </w:r>
-    </w:p>
-    <w:p>
-      <w:pPr>
-        <w:keepNext/>
-        <w:spacing w:after="120" w:line="276" w:lineRule="auto"/>
-      </w:pPr>
-      <w:r>
-        <w:rPr>
-          <w:rFonts w:ascii="Times New Roman" w:hAnsi="Times New Roman"/>
-          <w:b/>
-          <w:color w:val="000000"/>
-          <w:sz w:val="28"/>
-        </w:rPr>
-        <w:t>Результаты выполнения</w:t>
-      </w:r>
-    </w:p>
-    <w:p>
       <w:r>
         <w:drawing>
           <wp:inline xmlns:a="http://schemas.openxmlformats.org/drawingml/2006/main" xmlns:pic="http://schemas.openxmlformats.org/drawingml/2006/picture">
-            <wp:extent cx="5760720" cy="2741308"/>
-            <wp:docPr id="102" name="Picture 1"/>
+            <wp:extent cx="5806440" cy="2455294"/>
+            <wp:docPr id="102" name="Picture 102"/>
             <wp:cNvGraphicFramePr>
               <a:graphicFrameLocks noChangeAspect="1"/>
             </wp:cNvGraphicFramePr>
@@ -1341,7 +2319,7 @@
                     <pic:cNvPicPr/>
                   </pic:nvPicPr>
                   <pic:blipFill>
-                    <a:blip r:embed="rId108"/>
+                    <a:blip r:embed="rId7"/>
                     <a:stretch>
                       <a:fillRect/>
                     </a:stretch>
@@ -1349,7 +2327,7 @@
                   <pic:spPr>
                     <a:xfrm>
                       <a:off x="0" y="0"/>
-                      <a:ext cx="5760720" cy="2741308"/>
+                      <a:ext cx="5806440" cy="2455294"/>
                     </a:xfrm>
                     <a:prstGeom prst="rect"/>
                   </pic:spPr>
@@ -1362,7 +2340,7 @@
     </w:p>
     <w:p>
       <w:pPr>
-        <w:spacing w:after="120" w:line="276" w:lineRule="auto"/>
+        <w:spacing w:after="120" w:line="269" w:lineRule="auto"/>
       </w:pPr>
       <w:r>
         <w:rPr>
@@ -1371,27 +2349,13 @@
           <w:color w:val="000000"/>
           <w:sz w:val="20"/>
         </w:rPr>
-        <w:t>Рисунок 1. Экранная форма фактического вывода программы</w:t>
-      </w:r>
-    </w:p>
-    <w:p>
-      <w:pPr>
-        <w:spacing w:after="120" w:line="276" w:lineRule="auto"/>
-      </w:pPr>
-      <w:r>
-        <w:rPr>
-          <w:rFonts w:ascii="Times New Roman" w:hAnsi="Times New Roman"/>
-          <w:b w:val="0"/>
-          <w:color w:val="000000"/>
-          <w:sz w:val="20"/>
-        </w:rPr>
-        <w:t>Изображение построено по сохранённому stdout и stderr. Полные журналы приведены в папке results.</w:t>
+        <w:t>Рисунок 1. Фактический вывод программы, оформленный по сохранённому stdout.</w:t>
       </w:r>
     </w:p>
     <w:p>
       <w:pPr>
         <w:keepNext/>
-        <w:spacing w:after="120" w:line="276" w:lineRule="auto"/>
+        <w:spacing w:after="120" w:line="269" w:lineRule="auto"/>
       </w:pPr>
       <w:r>
         <w:rPr>
@@ -1400,12 +2364,12 @@
           <w:color w:val="000000"/>
           <w:sz w:val="28"/>
         </w:rPr>
-        <w:t>Проверка и вывод</w:t>
-      </w:r>
-    </w:p>
-    <w:p>
-      <w:pPr>
-        <w:spacing w:after="120" w:line="276" w:lineRule="auto"/>
+        <w:t>Проверка результатов</w:t>
+      </w:r>
+    </w:p>
+    <w:p>
+      <w:pPr>
+        <w:spacing w:after="120" w:line="269" w:lineRule="auto"/>
       </w:pPr>
       <w:r>
         <w:rPr>
@@ -1414,13 +2378,41 @@
           <w:color w:val="000000"/>
           <w:sz w:val="24"/>
         </w:rPr>
-        <w:t>Суммы арностей: Python — 4, Rust — 2, Ada — 1. В А3 для Rust выводятся + и -, что подтверждает использование связи M:N. Все три результата сопоставлены с функциями рефакторинга РК-2 скриптом tools/verify_extra.py; расхождений нет.</w:t>
+        <w:t>Б1: 4 пары упорядочены по названию произведения. Б2: Камерный — 1, Филармонический — 1, Симфонический — 2; сумма равна 4. Б3: «Вальс цветов» — два оркестра, «Танец эльфов» — один. Названия без окончания «ов» исключены.</w:t>
+      </w:r>
+    </w:p>
+    <w:p>
+      <w:pPr>
+        <w:spacing w:after="0" w:line="210" w:lineRule="exact"/>
+      </w:pPr>
+      <w:r>
+        <w:rPr>
+          <w:rFonts w:ascii="Courier New" w:hAnsi="Courier New"/>
+          <w:b w:val="0"/>
+          <w:color w:val="000000"/>
+          <w:sz w:val="20"/>
+        </w:rPr>
+        <w:t>python3 -m unittest rk_01.test_queries -v</w:t>
+      </w:r>
+    </w:p>
+    <w:p>
+      <w:pPr>
+        <w:spacing w:after="120" w:line="269" w:lineRule="auto"/>
+      </w:pPr>
+      <w:r>
+        <w:rPr>
+          <w:rFonts w:ascii="Times New Roman" w:hAnsi="Times New Roman"/>
+          <w:b w:val="0"/>
+          <w:color w:val="000000"/>
+          <w:sz w:val="24"/>
+        </w:rPr>
+        <w:t>Все 6 тестов пройдены. Проверены точные результаты Б1–Б3, пустые коллекции, пустой оркестр, одинаковые названия при разных ID, регистр и отсутствие связей. Полный журнал: rk_01/results/checks.txt.</w:t>
       </w:r>
     </w:p>
     <w:p>
       <w:pPr>
         <w:keepNext/>
-        <w:spacing w:after="120" w:line="276" w:lineRule="auto"/>
+        <w:spacing w:after="120" w:line="269" w:lineRule="auto"/>
       </w:pPr>
       <w:r>
         <w:rPr>
@@ -1434,21 +2426,21 @@
     </w:p>
     <w:p>
       <w:pPr>
-        <w:spacing w:after="120" w:line="276" w:lineRule="auto"/>
+        <w:spacing w:after="120" w:line="269" w:lineRule="auto"/>
       </w:pPr>
       <w:r>
         <w:rPr>
           <w:rFonts w:ascii="Times New Roman" w:hAnsi="Times New Roman"/>
           <w:b w:val="0"/>
           <w:color w:val="000000"/>
-          <w:sz w:val="20"/>
-        </w:rPr>
-        <w:t>Условия РК-1, таблица вариантов, строка 21 и запросы А. Проверено 19 октября 2026 года.</w:t>
-      </w:r>
-    </w:p>
-    <w:p>
-      <w:pPr>
-        <w:spacing w:after="120" w:line="276" w:lineRule="auto"/>
+          <w:sz w:val="24"/>
+        </w:rPr>
+        <w:t>Страница курса COURSE_PCPL_MAIN_2026 и PDF задания РК1, страницы 1, 2 и 4. Сверено 28 октября 2026 года. В программе применены list comprehensions, генераторы, sorted(), sum(), any() и lambda-функции. Все три запроса выполнены.</w:t>
+      </w:r>
+    </w:p>
+    <w:p>
+      <w:pPr>
+        <w:spacing w:after="120" w:line="269" w:lineRule="auto"/>
       </w:pPr>
       <w:r>
         <w:rPr>
@@ -1468,7 +2460,7 @@
     <w:p>
       <w:pPr>
         <w:keepNext/>
-        <w:spacing w:after="120" w:line="276" w:lineRule="auto"/>
+        <w:spacing w:after="120" w:line="269" w:lineRule="auto"/>
       </w:pPr>
       <w:r>
         <w:rPr>
@@ -1482,8 +2474,9 @@
     </w:p>
     <w:p>
       <w:pPr>
+        <w:keepLines w:val="0"/>
         <w:widowControl w:val="0"/>
-        <w:spacing w:after="0" w:line="224" w:lineRule="exact"/>
+        <w:spacing w:after="0" w:line="210" w:lineRule="exact"/>
       </w:pPr>
       <w:r>
         <w:rPr>
@@ -1492,89 +2485,94 @@
           <w:color w:val="000000"/>
           <w:sz w:val="18"/>
         </w:rPr>
-        <w:br/>
-        <w:t># Файл main.py</w:t>
-        <w:br/>
-        <w:br/>
-        <w:t>"""РК-1. Вариант 21, запросы А. Запуск: python3 rk_01/main.py."""</w:t>
-        <w:br/>
-        <w:br/>
-        <w:t>from operator import itemgetter</w:t>
-        <w:br/>
-        <w:br/>
-        <w:br/>
-        <w:t>class Operator:</w:t>
-        <w:br/>
-        <w:t xml:space="preserve">    """Оператор: ключ, название, число операндов, основной язык."""</w:t>
-        <w:br/>
-        <w:br/>
-        <w:t xml:space="preserve">    def __init__(self, id, name, arity, language_id):</w:t>
+        <w:t>"""РК-1: предметная область 18, запросы Б. Python 3.10+."""</w:t>
+        <w:br/>
+        <w:br/>
+        <w:br/>
+        <w:t>class MusicalWork:</w:t>
+        <w:br/>
+        <w:t xml:space="preserve">    """Произведение: ID, название, длительность и основной оркестр."""</w:t>
+        <w:br/>
+        <w:br/>
+        <w:t xml:space="preserve">    def __init__(self, id, title, duration_minutes, orchestra_id):</w:t>
         <w:br/>
         <w:t xml:space="preserve">        self.id = id</w:t>
         <w:br/>
+        <w:t xml:space="preserve">        self.title = title</w:t>
+        <w:br/>
+        <w:t xml:space="preserve">        self.duration_minutes = duration_minutes</w:t>
+        <w:br/>
+        <w:t xml:space="preserve">        self.orchestra_id = orchestra_id</w:t>
+        <w:br/>
+        <w:br/>
+        <w:br/>
+        <w:t>class Orchestra:</w:t>
+        <w:br/>
+        <w:t xml:space="preserve">    """Оркестр: ID и название."""</w:t>
+        <w:br/>
+        <w:br/>
+        <w:t xml:space="preserve">    def __init__(self, id, name):</w:t>
+        <w:br/>
+        <w:t xml:space="preserve">        self.id = id</w:t>
+        <w:br/>
         <w:t xml:space="preserve">        self.name = name</w:t>
         <w:br/>
-        <w:t xml:space="preserve">        self.arity = arity</w:t>
-        <w:br/>
-        <w:t xml:space="preserve">        self.language_id = language_id</w:t>
-        <w:br/>
-        <w:br/>
-        <w:br/>
-        <w:t>class Language:</w:t>
-        <w:br/>
-        <w:t xml:space="preserve">    """Язык программирования на стороне «один»."""</w:t>
-        <w:br/>
-        <w:br/>
-        <w:t xml:space="preserve">    def __init__(self, id, name):</w:t>
-        <w:br/>
-        <w:t xml:space="preserve">        self.id = id</w:t>
-        <w:br/>
-        <w:t xml:space="preserve">        self.name = name</w:t>
-        <w:br/>
-        <w:br/>
-        <w:br/>
-        <w:t>class OperatorLanguage:</w:t>
-        <w:br/>
-        <w:t xml:space="preserve">    """Связь многие-ко-многим по идентификаторам."""</w:t>
-        <w:br/>
-        <w:br/>
-        <w:t xml:space="preserve">    def __init__(self, operator_id, language_id):</w:t>
-        <w:br/>
-        <w:t xml:space="preserve">        self.operator_id = operator_id</w:t>
-        <w:br/>
-        <w:t xml:space="preserve">        self.language_id = language_id</w:t>
-        <w:br/>
-        <w:br/>
-        <w:br/>
-        <w:t>def main():</w:t>
-        <w:br/>
-        <w:t xml:space="preserve">    # Учебные данные: арность означает число операндов оператора.</w:t>
-        <w:br/>
-        <w:t xml:space="preserve">    # Основной язык нужен для связи 1:N, а не обозначает происхождение.</w:t>
-        <w:br/>
-        <w:t xml:space="preserve">    languages = [</w:t>
-        <w:br/>
-        <w:t xml:space="preserve">        Language(1, "язык Python"),</w:t>
-        <w:br/>
-        <w:t xml:space="preserve">        Language(2, "язык Rust"),</w:t>
-        <w:br/>
-        <w:t xml:space="preserve">        Language(3, "язык Ada"),</w:t>
+        <w:br/>
+        <w:br/>
+        <w:t>class WorkOrchestra:</w:t>
+        <w:br/>
+        <w:t xml:space="preserve">    """Связь M:N: ID произведения и ID исполняющего его оркестра."""</w:t>
+        <w:br/>
+        <w:br/>
+        <w:t xml:space="preserve">    def __init__(self, work_id, orchestra_id):</w:t>
+        <w:br/>
+        <w:t xml:space="preserve">        self.work_id = work_id</w:t>
+        <w:br/>
+        <w:t xml:space="preserve">        self.orchestra_id = orchestra_id</w:t>
+        <w:br/>
+        <w:br/>
+        <w:br/>
+        <w:t>def sample_data():</w:t>
+        <w:br/>
+        <w:t xml:space="preserve">    """Учебное распределение репертуара, а не концертная афиша."""</w:t>
+        <w:br/>
+        <w:t xml:space="preserve">    orchestras = [</w:t>
+        <w:br/>
+        <w:t xml:space="preserve">        Orchestra(1, "Симфонический оркестр"),</w:t>
+        <w:br/>
+        <w:t xml:space="preserve">        Orchestra(2, "Камерный оркестр"),</w:t>
+        <w:br/>
+        <w:t xml:space="preserve">        Orchestra(3, "Филармонический оркестр"),</w:t>
         <w:br/>
         <w:t xml:space="preserve">    ]</w:t>
         <w:br/>
-        <w:t xml:space="preserve">    operators = [</w:t>
-        <w:br/>
-        <w:t xml:space="preserve">        Operator(1, "+", 2, 1),</w:t>
-        <w:br/>
-        <w:t xml:space="preserve">        Operator(2, "*", 2, 1),</w:t>
-        <w:br/>
-        <w:t xml:space="preserve">        Operator(3, "not", 1, 3),</w:t>
-        <w:br/>
-        <w:t xml:space="preserve">        Operator(4, "-", 2, 2),</w:t>
+        <w:t xml:space="preserve">    works = [</w:t>
+        <w:br/>
+        <w:t xml:space="preserve">        MusicalWork(1, "Вальс цветов", 8, 1),</w:t>
+        <w:br/>
+        <w:t xml:space="preserve">        MusicalWork(2, "Танец эльфов", 3, 2),</w:t>
+        <w:br/>
+        <w:t xml:space="preserve">        MusicalWork(3, "Танец рыцарей", 5, 1),</w:t>
+        <w:br/>
+        <w:t xml:space="preserve">        MusicalWork(4, "Полет шмеля", 2, 3),</w:t>
         <w:br/>
         <w:t xml:space="preserve">    ]</w:t>
         <w:br/>
         <w:t xml:space="preserve">    links = [</w:t>
+        <w:br/>
+        <w:t xml:space="preserve">        WorkOrchestra(1, 1),</w:t>
+        <w:br/>
+        <w:t xml:space="preserve">        WorkOrchestra(1, 2),</w:t>
+        <w:br/>
+        <w:t xml:space="preserve">        WorkOrchestra(2, 2),</w:t>
+        <w:br/>
+        <w:t xml:space="preserve">        WorkOrchestra(3, 1),</w:t>
+        <w:br/>
+        <w:t xml:space="preserve">        WorkOrchestra(4, 3),</w:t>
+        <w:br/>
+        <w:t xml:space="preserve">    ]</w:t>
+        <w:br/>
+        <w:t xml:space="preserve">    return works, orchestras, links</w:t>
       </w:r>
     </w:p>
     <w:p>
@@ -1585,7 +2583,7 @@
     <w:p>
       <w:pPr>
         <w:keepNext/>
-        <w:spacing w:after="120" w:line="276" w:lineRule="auto"/>
+        <w:spacing w:after="120" w:line="269" w:lineRule="auto"/>
       </w:pPr>
       <w:r>
         <w:rPr>
@@ -1599,8 +2597,9 @@
     </w:p>
     <w:p>
       <w:pPr>
+        <w:keepLines w:val="0"/>
         <w:widowControl w:val="0"/>
-        <w:spacing w:after="0" w:line="224" w:lineRule="exact"/>
+        <w:spacing w:after="0" w:line="210" w:lineRule="exact"/>
       </w:pPr>
       <w:r>
         <w:rPr>
@@ -1609,91 +2608,97 @@
           <w:color w:val="000000"/>
           <w:sz w:val="18"/>
         </w:rPr>
-        <w:t xml:space="preserve">        OperatorLanguage(1, 1),</w:t>
-        <w:br/>
-        <w:t xml:space="preserve">        OperatorLanguage(1, 2),</w:t>
-        <w:br/>
-        <w:t xml:space="preserve">        OperatorLanguage(2, 1),</w:t>
-        <w:br/>
-        <w:t xml:space="preserve">        OperatorLanguage(3, 3),</w:t>
-        <w:br/>
-        <w:t xml:space="preserve">        OperatorLanguage(4, 2),</w:t>
+        <w:t>def query_b1(works, orchestras):</w:t>
+        <w:br/>
+        <w:t xml:space="preserve">    """Б1: связь 1:N, сортировка по названию произведения."""</w:t>
+        <w:br/>
+        <w:t xml:space="preserve">    one_to_many = [</w:t>
+        <w:br/>
+        <w:t xml:space="preserve">        (work.title, orchestra.name)</w:t>
+        <w:br/>
+        <w:t xml:space="preserve">        for work in works</w:t>
+        <w:br/>
+        <w:t xml:space="preserve">        for orchestra in orchestras</w:t>
+        <w:br/>
+        <w:t xml:space="preserve">        if work.orchestra_id == orchestra.id</w:t>
         <w:br/>
         <w:t xml:space="preserve">    ]</w:t>
         <w:br/>
-        <w:br/>
-        <w:t xml:space="preserve">    one_to_many = [</w:t>
-        <w:br/>
-        <w:t xml:space="preserve">        (op.name, op.arity, lang.name)</w:t>
-        <w:br/>
-        <w:t xml:space="preserve">        for lang in languages</w:t>
-        <w:br/>
-        <w:t xml:space="preserve">        for op in operators</w:t>
-        <w:br/>
-        <w:t xml:space="preserve">        if op.language_id == lang.id</w:t>
+        <w:t xml:space="preserve">    return sorted(one_to_many, key=lambda row: (row[0].casefold(), row[1]))</w:t>
+        <w:br/>
+        <w:br/>
+        <w:br/>
+        <w:t>def query_b2(works, orchestras):</w:t>
+        <w:br/>
+        <w:t xml:space="preserve">    """Б2: количество произведений по связи 1:N, по возрастанию."""</w:t>
+        <w:br/>
+        <w:t xml:space="preserve">    counts = [</w:t>
+        <w:br/>
+        <w:t xml:space="preserve">        (orchestra.name,</w:t>
+        <w:br/>
+        <w:t xml:space="preserve">         sum(1 for work in works if work.orchestra_id == orchestra.id))</w:t>
+        <w:br/>
+        <w:t xml:space="preserve">        for orchestra in orchestras</w:t>
         <w:br/>
         <w:t xml:space="preserve">    ]</w:t>
         <w:br/>
-        <w:t xml:space="preserve">    many_to_many = [</w:t>
-        <w:br/>
-        <w:t xml:space="preserve">        (op.name, op.arity, lang.name)</w:t>
-        <w:br/>
-        <w:t xml:space="preserve">        for link in links</w:t>
-        <w:br/>
-        <w:t xml:space="preserve">        for op in operators</w:t>
-        <w:br/>
-        <w:t xml:space="preserve">        for lang in languages</w:t>
-        <w:br/>
-        <w:t xml:space="preserve">        if op.id == link.operator_id and lang.id == link.language_id</w:t>
+        <w:t xml:space="preserve">    # При равном количестве дополнительно сортируем по названию оркестра.</w:t>
+        <w:br/>
+        <w:t xml:space="preserve">    return sorted(counts, key=lambda row: (row[1], row[0].casefold()))</w:t>
+        <w:br/>
+        <w:br/>
+        <w:br/>
+        <w:t>def query_b3(works, orchestras, links):</w:t>
+        <w:br/>
+        <w:t xml:space="preserve">    """Б3: названия на «ов» и оркестры через отдельную связь M:N."""</w:t>
+        <w:br/>
+        <w:t xml:space="preserve">    return [</w:t>
+        <w:br/>
+        <w:t xml:space="preserve">        (work.title, [</w:t>
+        <w:br/>
+        <w:t xml:space="preserve">            orchestra.name</w:t>
+        <w:br/>
+        <w:t xml:space="preserve">            for orchestra in orchestras</w:t>
+        <w:br/>
+        <w:t xml:space="preserve">            if any(link.work_id == work.id</w:t>
+        <w:br/>
+        <w:t xml:space="preserve">                   and link.orchestra_id == orchestra.id for link in links)</w:t>
+        <w:br/>
+        <w:t xml:space="preserve">        ])</w:t>
+        <w:br/>
+        <w:t xml:space="preserve">        for work in sorted(works, key=lambda work: work.title.casefold())</w:t>
+        <w:br/>
+        <w:t xml:space="preserve">        if work.title.casefold().endswith("ов")</w:t>
         <w:br/>
         <w:t xml:space="preserve">    ]</w:t>
         <w:br/>
         <w:br/>
-        <w:t xml:space="preserve">    print("РК-1. Вариант 21. Запросы А")</w:t>
-        <w:br/>
-        <w:t xml:space="preserve">    print("А1. Операторы и языки, сортировка по языкам")</w:t>
-        <w:br/>
-        <w:t xml:space="preserve">    for row in sorted(one_to_many, key=itemgetter(2, 0)):</w:t>
+        <w:br/>
+        <w:t>def main():</w:t>
+        <w:br/>
+        <w:t xml:space="preserve">    works, orchestras, links = sample_data()</w:t>
+        <w:br/>
+        <w:t xml:space="preserve">    print("РК-1. Вариант предметной области 18. Запросы Б")</w:t>
+        <w:br/>
+        <w:t xml:space="preserve">    print("Б1. Произведения и основные оркестры, по названию произведения")</w:t>
+        <w:br/>
+        <w:t xml:space="preserve">    for row in query_b1(works, orchestras):</w:t>
         <w:br/>
         <w:t xml:space="preserve">        print(row)</w:t>
         <w:br/>
         <w:br/>
-        <w:t xml:space="preserve">    print("\nА2. Суммарная арность по языкам, по убыванию")</w:t>
-        <w:br/>
-        <w:t xml:space="preserve">    totals = [</w:t>
-        <w:br/>
-        <w:t xml:space="preserve">        (lang.name, sum(row[1] for row in one_to_many</w:t>
-        <w:br/>
-        <w:t xml:space="preserve">                        if row[2] == lang.name))</w:t>
-        <w:br/>
-        <w:t xml:space="preserve">        for lang in languages</w:t>
-        <w:br/>
-        <w:t xml:space="preserve">        if any(row[2] == lang.name for row in one_to_many)</w:t>
-        <w:br/>
-        <w:t xml:space="preserve">    ]</w:t>
-        <w:br/>
-        <w:t xml:space="preserve">    for row in sorted(totals, key=lambda row: (-row[1], row[0])):</w:t>
+        <w:t xml:space="preserve">    print("\nБ2. Оркестры и количество произведений, по возрастанию")</w:t>
+        <w:br/>
+        <w:t xml:space="preserve">    for row in query_b2(works, orchestras):</w:t>
         <w:br/>
         <w:t xml:space="preserve">        print(row)</w:t>
         <w:br/>
         <w:br/>
-        <w:t xml:space="preserve">    print("\nА3. Слово 'язык' в названии, связь M:N")</w:t>
-        <w:br/>
-        <w:t xml:space="preserve">    result = {</w:t>
-        <w:br/>
-        <w:t xml:space="preserve">        lang.name: [name for name, _, language in many_to_many</w:t>
-        <w:br/>
-        <w:t xml:space="preserve">                    if language == lang.name]</w:t>
-        <w:br/>
-        <w:t xml:space="preserve">        for lang in languages</w:t>
-        <w:br/>
-        <w:t xml:space="preserve">        if "язык" in lang.name.casefold().split()</w:t>
-        <w:br/>
-        <w:t xml:space="preserve">    }</w:t>
-        <w:br/>
-        <w:t xml:space="preserve">    for language, names in result.items():</w:t>
-        <w:br/>
-        <w:t xml:space="preserve">        print(f"{language}: {', '.join(names)}")</w:t>
+        <w:t xml:space="preserve">    print("\nБ3. Произведения с окончанием 'ов' и их оркестры, связь M:N")</w:t>
+        <w:br/>
+        <w:t xml:space="preserve">    for title, names in query_b3(works, orchestras, links):</w:t>
+        <w:br/>
+        <w:t xml:space="preserve">        print(f"{title}: {', '.join(names) if names else 'нет оркестров'}")</w:t>
         <w:br/>
         <w:br/>
         <w:br/>

</xml_diff>